<commit_message>
feat: implement title case formatting for generated document data and mount templates in Docker container
</commit_message>
<xml_diff>
--- a/apps/web/public/templates/Surat_Domisili.docx
+++ b/apps/web/public/templates/Surat_Domisili.docx
@@ -1,6 +1,6 @@
 
 <file path=word/document.xml><?xml version="1.0" encoding="utf-8"?>
-<w:document xmlns:wpc="http://schemas.microsoft.com/office/word/2010/wordprocessingCanvas" xmlns:cx="http://schemas.microsoft.com/office/drawing/2014/chartex" xmlns:cx1="http://schemas.microsoft.com/office/drawing/2015/9/8/chartex" xmlns:cx2="http://schemas.microsoft.com/office/drawing/2015/10/21/chartex" xmlns:cx3="http://schemas.microsoft.com/office/drawing/2016/5/9/chartex" xmlns:cx4="http://schemas.microsoft.com/office/drawing/2016/5/10/chartex" xmlns:cx5="http://schemas.microsoft.com/office/drawing/2016/5/11/chartex" xmlns:cx6="http://schemas.microsoft.com/office/drawing/2016/5/12/chartex" xmlns:cx7="http://schemas.microsoft.com/office/drawing/2016/5/13/chartex" xmlns:cx8="http://schemas.microsoft.com/office/drawing/2016/5/14/chartex" xmlns:mc="http://schemas.openxmlformats.org/markup-compatibility/2006" xmlns:aink="http://schemas.microsoft.com/office/drawing/2016/ink" xmlns:am3d="http://schemas.microsoft.com/office/drawing/2017/model3d" xmlns:o="urn:schemas-microsoft-com:office:office" xmlns:oel="http://schemas.microsoft.com/office/2019/extlst" xmlns:r="http://schemas.openxmlformats.org/officeDocument/2006/relationships" xmlns:m="http://schemas.openxmlformats.org/officeDocument/2006/math" xmlns:v="urn:schemas-microsoft-com:vml" xmlns:wp14="http://schemas.microsoft.com/office/word/2010/wordprocessingDrawing" xmlns:wp="http://schemas.openxmlformats.org/drawingml/2006/wordprocessingDrawing" xmlns:w10="urn:schemas-microsoft-com:office:word" xmlns:w="http://schemas.openxmlformats.org/wordprocessingml/2006/main" xmlns:w14="http://schemas.microsoft.com/office/word/2010/wordml" xmlns:w15="http://schemas.microsoft.com/office/word/2012/wordml" xmlns:w16cei="http://schemas.microsoft.com/office/word/2026/wordml/cei" xmlns:w16cex="http://schemas.microsoft.com/office/word/2018/wordml/cex" xmlns:w16cid="http://schemas.microsoft.com/office/word/2016/wordml/cid" xmlns:w16="http://schemas.microsoft.com/office/word/2018/wordml" xmlns:w16du="http://schemas.microsoft.com/office/word/2023/wordml/word16du" xmlns:w16sdtdh="http://schemas.microsoft.com/office/word/2020/wordml/sdtdatahash" xmlns:w16sdtfl="http://schemas.microsoft.com/office/word/2024/wordml/sdtformatlock" xmlns:w16se="http://schemas.microsoft.com/office/word/2015/wordml/symex" xmlns:wpg="http://schemas.microsoft.com/office/word/2010/wordprocessingGroup" xmlns:wpi="http://schemas.microsoft.com/office/word/2010/wordprocessingInk" xmlns:wne="http://schemas.microsoft.com/office/word/2006/wordml" xmlns:wps="http://schemas.microsoft.com/office/word/2010/wordprocessingShape" mc:Ignorable="w14 w15 w16se w16cid w16 w16cex w16sdtdh w16sdtfl w16du wp14">
+<w:document xmlns:wpc="http://schemas.microsoft.com/office/word/2010/wordprocessingCanvas" xmlns:cx="http://schemas.microsoft.com/office/drawing/2014/chartex" xmlns:cx1="http://schemas.microsoft.com/office/drawing/2015/9/8/chartex" xmlns:cx2="http://schemas.microsoft.com/office/drawing/2015/10/21/chartex" xmlns:cx3="http://schemas.microsoft.com/office/drawing/2016/5/9/chartex" xmlns:cx4="http://schemas.microsoft.com/office/drawing/2016/5/10/chartex" xmlns:cx5="http://schemas.microsoft.com/office/drawing/2016/5/11/chartex" xmlns:cx6="http://schemas.microsoft.com/office/drawing/2016/5/12/chartex" xmlns:cx7="http://schemas.microsoft.com/office/drawing/2016/5/13/chartex" xmlns:cx8="http://schemas.microsoft.com/office/drawing/2016/5/14/chartex" xmlns:mc="http://schemas.openxmlformats.org/markup-compatibility/2006" xmlns:m="http://schemas.openxmlformats.org/officeDocument/2006/math" xmlns:aink="http://schemas.microsoft.com/office/drawing/2016/ink" xmlns:am3d="http://schemas.microsoft.com/office/drawing/2017/model3d" xmlns:oel="http://schemas.microsoft.com/office/2019/extlst" xmlns:r="http://schemas.openxmlformats.org/officeDocument/2006/relationships" xmlns:wp14="http://schemas.microsoft.com/office/word/2010/wordprocessingDrawing" xmlns:wp="http://schemas.openxmlformats.org/drawingml/2006/wordprocessingDrawing" xmlns:wpg="http://schemas.microsoft.com/office/word/2010/wordprocessingGroup" xmlns:wpi="http://schemas.microsoft.com/office/word/2010/wordprocessingInk" xmlns:wps="http://schemas.microsoft.com/office/word/2010/wordprocessingShape" xmlns:o="urn:schemas-microsoft-com:office:office" xmlns:v="urn:schemas-microsoft-com:vml" xmlns:w10="urn:schemas-microsoft-com:office:word" xmlns:w="http://schemas.openxmlformats.org/wordprocessingml/2006/main" xmlns:w14="http://schemas.microsoft.com/office/word/2010/wordml" xmlns:w15="http://schemas.microsoft.com/office/word/2012/wordml" xmlns:w16cex="http://schemas.microsoft.com/office/word/2018/wordml/cex" xmlns:w16cid="http://schemas.microsoft.com/office/word/2016/wordml/cid" xmlns:w16="http://schemas.microsoft.com/office/word/2018/wordml" xmlns:w16sdtdh="http://schemas.microsoft.com/office/word/2020/wordml/sdtdatahash" xmlns:w16sdtfl="http://schemas.microsoft.com/office/word/2024/wordml/sdtformatlock" xmlns:w16se="http://schemas.microsoft.com/office/word/2015/wordml/symex" xmlns:w16du="http://schemas.microsoft.com/office/word/2023/wordml/word16du" xmlns:wne="http://schemas.microsoft.com/office/word/2006/wordml" mc:Ignorable="w14 w15 w16se w16cid w16 w16cex w16sdtdh w16sdtfl w16du wp14">
   <w:body>
     <w:p>
       <w:pPr>
@@ -160,11 +160,19 @@
           <w:sz w:val="20"/>
         </w:rPr>
       </w:pPr>
-      <w:r>
-        <w:rPr>
-          <w:sz w:val="20"/>
-        </w:rPr>
-        <w:t>Alamat:Jln.</w:t>
+      <w:proofErr w:type="spellStart"/>
+      <w:r>
+        <w:rPr>
+          <w:sz w:val="20"/>
+        </w:rPr>
+        <w:t>Alamat:Jln</w:t>
+      </w:r>
+      <w:proofErr w:type="spellEnd"/>
+      <w:r>
+        <w:rPr>
+          <w:sz w:val="20"/>
+        </w:rPr>
+        <w:t>.</w:t>
       </w:r>
       <w:r>
         <w:rPr>
@@ -186,12 +194,14 @@
         </w:rPr>
         <w:t xml:space="preserve"> </w:t>
       </w:r>
+      <w:proofErr w:type="spellStart"/>
       <w:r>
         <w:rPr>
           <w:sz w:val="20"/>
         </w:rPr>
         <w:t>Sukarama</w:t>
       </w:r>
+      <w:proofErr w:type="spellEnd"/>
       <w:r>
         <w:rPr>
           <w:spacing w:val="-2"/>
@@ -225,12 +235,14 @@
         </w:rPr>
         <w:t xml:space="preserve"> </w:t>
       </w:r>
+      <w:proofErr w:type="spellStart"/>
       <w:r>
         <w:rPr>
           <w:sz w:val="20"/>
         </w:rPr>
         <w:t>Bojongpicung-Cianjur</w:t>
       </w:r>
+      <w:proofErr w:type="spellEnd"/>
       <w:r>
         <w:rPr>
           <w:spacing w:val="-3"/>
@@ -264,12 +276,14 @@
         </w:rPr>
         <w:t xml:space="preserve"> </w:t>
       </w:r>
+      <w:proofErr w:type="spellStart"/>
       <w:r>
         <w:rPr>
           <w:sz w:val="20"/>
         </w:rPr>
         <w:t>Kode</w:t>
       </w:r>
+      <w:proofErr w:type="spellEnd"/>
       <w:r>
         <w:rPr>
           <w:spacing w:val="-2"/>
@@ -307,7 +321,21 @@
         <w:rPr>
           <w:sz w:val="20"/>
         </w:rPr>
-        <w:t>e-mail:</w:t>
+        <w:t>e-</w:t>
+      </w:r>
+      <w:proofErr w:type="spellStart"/>
+      <w:r>
+        <w:rPr>
+          <w:sz w:val="20"/>
+        </w:rPr>
+        <w:t>mail</w:t>
+      </w:r>
+      <w:proofErr w:type="spellEnd"/>
+      <w:r>
+        <w:rPr>
+          <w:sz w:val="20"/>
+        </w:rPr>
+        <w:t>:</w:t>
       </w:r>
       <w:r>
         <w:rPr>
@@ -523,7 +551,7 @@
               </wp:anchor>
             </w:drawing>
           </mc:Choice>
-          <mc:Fallback>
+          <mc:Fallback xmlns:w16cei="http://schemas.microsoft.com/office/word/2026/wordml/cei">
             <w:pict>
               <v:shape w14:anchorId="42C8C94F" id="AutoShape 4" o:spid="_x0000_s1026" style="position:absolute;margin-left:42pt;margin-top:6.95pt;width:528pt;height:2pt;z-index:-15728640;visibility:visible;mso-wrap-style:square;mso-width-percent:0;mso-height-percent:0;mso-wrap-distance-left:0;mso-wrap-distance-top:0;mso-wrap-distance-right:0;mso-wrap-distance-bottom:0;mso-position-horizontal:absolute;mso-position-horizontal-relative:page;mso-position-vertical:absolute;mso-position-vertical-relative:text;mso-width-percent:0;mso-height-percent:0;mso-width-relative:page;mso-height-relative:page;v-text-anchor:top" coordsize="10560,40" o:gfxdata="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" path="m10560,30l,30,,40r10560,l10560,30xm10560,l,,,10r10560,l10560,xe" fillcolor="black" stroked="f">
                 <v:path arrowok="t" o:connecttype="custom" o:connectlocs="6705600,107315;0,107315;0,113665;6705600,113665;6705600,107315;6705600,88265;0,88265;0,94615;6705600,94615;6705600,88265" o:connectangles="0,0,0,0,0,0,0,0,0,0"/>
@@ -662,7 +690,7 @@
               </wp:inline>
             </w:drawing>
           </mc:Choice>
-          <mc:Fallback>
+          <mc:Fallback xmlns:w16cei="http://schemas.microsoft.com/office/word/2026/wordml/cei">
             <w:pict>
               <v:group w14:anchorId="404917BD" id="Group 2" o:spid="_x0000_s1026" style="width:201.7pt;height:1.5pt;mso-position-horizontal-relative:char;mso-position-vertical-relative:line" coordsize="4034,30" o:gfxdata="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">
                 <v:rect id="Rectangle 3" o:spid="_x0000_s1027" style="position:absolute;width:4034;height:30;visibility:visible;mso-wrap-style:square;v-text-anchor:top" o:gfxdata="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" fillcolor="black" stroked="f"/>
@@ -683,7 +711,15 @@
         <w:t xml:space="preserve">NOMOR : </w:t>
       </w:r>
       <w:r>
-        <w:t>{nomor_surat}</w:t>
+        <w:t>{</w:t>
+      </w:r>
+      <w:proofErr w:type="spellStart"/>
+      <w:r>
+        <w:t>nomor_surat</w:t>
+      </w:r>
+      <w:proofErr w:type="spellEnd"/>
+      <w:r>
+        <w:t>}</w:t>
       </w:r>
     </w:p>
     <w:p>
@@ -790,10 +826,26 @@
       </w:r>
       <w:r>
         <w:rPr>
-          <w:spacing w:val="-4"/>
           <w:sz w:val="24"/>
-        </w:rPr>
-        <w:t>{nama_penandatangan}</w:t>
+          <w:szCs w:val="24"/>
+        </w:rPr>
+        <w:t>{</w:t>
+      </w:r>
+      <w:proofErr w:type="spellStart"/>
+      <w:r>
+        <w:rPr>
+          <w:sz w:val="24"/>
+          <w:szCs w:val="24"/>
+        </w:rPr>
+        <w:t>nama_penandatangan</w:t>
+      </w:r>
+      <w:proofErr w:type="spellEnd"/>
+      <w:r>
+        <w:rPr>
+          <w:sz w:val="24"/>
+          <w:szCs w:val="24"/>
+        </w:rPr>
+        <w:t>}</w:t>
       </w:r>
     </w:p>
     <w:p>
@@ -813,16 +865,18 @@
         <w:t>:</w:t>
       </w:r>
       <w:r>
-        <w:rPr>
-          <w:spacing w:val="15"/>
-        </w:rPr>
-        <w:t xml:space="preserve"> </w:t>
-      </w:r>
-      <w:r>
-        <w:rPr>
-          <w:spacing w:val="15"/>
-        </w:rPr>
-        <w:t>{jabatan_penandatangan}</w:t>
+        <w:t xml:space="preserve"> </w:t>
+      </w:r>
+      <w:r>
+        <w:t>{</w:t>
+      </w:r>
+      <w:proofErr w:type="spellStart"/>
+      <w:r>
+        <w:t>jabatan_penandatangan</w:t>
+      </w:r>
+      <w:proofErr w:type="spellEnd"/>
+      <w:r>
+        <w:t>}</w:t>
       </w:r>
     </w:p>
     <w:p>
@@ -832,7 +886,15 @@
         <w:ind w:left="100"/>
       </w:pPr>
       <w:r>
-        <w:t>Dengan ini menerangkan bahwa :</w:t>
+        <w:t xml:space="preserve">Dengan ini menerangkan </w:t>
+      </w:r>
+      <w:proofErr w:type="spellStart"/>
+      <w:r>
+        <w:t>bahwa</w:t>
+      </w:r>
+      <w:proofErr w:type="spellEnd"/>
+      <w:r>
+        <w:t xml:space="preserve"> :</w:t>
       </w:r>
     </w:p>
     <w:p>
@@ -843,8 +905,8 @@
         <w:spacing w:before="24"/>
         <w:ind w:left="100"/>
         <w:rPr>
-          <w:b/>
           <w:sz w:val="24"/>
+          <w:szCs w:val="24"/>
           <w:lang w:val="id-ID"/>
         </w:rPr>
       </w:pPr>
@@ -876,8 +938,8 @@
       </w:r>
       <w:r>
         <w:rPr>
-          <w:spacing w:val="-4"/>
           <w:sz w:val="24"/>
+          <w:szCs w:val="24"/>
         </w:rPr>
         <w:t>{nama}</w:t>
       </w:r>
@@ -902,15 +964,9 @@
         <w:t>:</w:t>
       </w:r>
       <w:r>
-        <w:rPr>
-          <w:spacing w:val="25"/>
-        </w:rPr>
-        <w:t xml:space="preserve"> </w:t>
-      </w:r>
-      <w:r>
-        <w:rPr>
-          <w:spacing w:val="25"/>
-        </w:rPr>
+        <w:t xml:space="preserve"> </w:t>
+      </w:r>
+      <w:r>
         <w:t>{nik}</w:t>
       </w:r>
     </w:p>
@@ -949,10 +1005,15 @@
         <w:t xml:space="preserve"> </w:t>
       </w:r>
       <w:r>
-        <w:rPr>
-          <w:spacing w:val="13"/>
-        </w:rPr>
-        <w:t>{tempat_tanggal_lahir}</w:t>
+        <w:t>{</w:t>
+      </w:r>
+      <w:proofErr w:type="spellStart"/>
+      <w:r>
+        <w:t>tempat_tanggal_lahir</w:t>
+      </w:r>
+      <w:proofErr w:type="spellEnd"/>
+      <w:r>
+        <w:t>}</w:t>
       </w:r>
     </w:p>
     <w:p>
@@ -981,10 +1042,15 @@
         <w:t xml:space="preserve"> </w:t>
       </w:r>
       <w:r>
-        <w:rPr>
-          <w:spacing w:val="25"/>
-        </w:rPr>
-        <w:t>{jenisKelamin}</w:t>
+        <w:t>{</w:t>
+      </w:r>
+      <w:proofErr w:type="spellStart"/>
+      <w:r>
+        <w:t>jenisKelamin</w:t>
+      </w:r>
+      <w:proofErr w:type="spellEnd"/>
+      <w:r>
+        <w:t>}</w:t>
       </w:r>
     </w:p>
     <w:p>
@@ -1000,8 +1066,13 @@
         </w:rPr>
       </w:pPr>
       <w:r>
-        <w:t>Status Perkawinan</w:t>
-      </w:r>
+        <w:t xml:space="preserve">Status </w:t>
+      </w:r>
+      <w:proofErr w:type="spellStart"/>
+      <w:r>
+        <w:t>Perkawinan</w:t>
+      </w:r>
+      <w:proofErr w:type="spellEnd"/>
       <w:r>
         <w:tab/>
         <w:t>:</w:t>
@@ -1013,10 +1084,15 @@
         <w:t xml:space="preserve"> </w:t>
       </w:r>
       <w:r>
-        <w:rPr>
-          <w:spacing w:val="1"/>
-        </w:rPr>
-        <w:t>{statusPerkawinan}</w:t>
+        <w:t>{</w:t>
+      </w:r>
+      <w:proofErr w:type="spellStart"/>
+      <w:r>
+        <w:t>statusPerkawinan</w:t>
+      </w:r>
+      <w:proofErr w:type="spellEnd"/>
+      <w:r>
+        <w:t>}</w:t>
       </w:r>
     </w:p>
     <w:p>
@@ -1051,7 +1127,6 @@
       </w:r>
       <w:r>
         <w:rPr>
-          <w:spacing w:val="1"/>
           <w:lang w:val="id-ID"/>
         </w:rPr>
         <w:t>{agama}</w:t>
@@ -1083,9 +1158,6 @@
         <w:t xml:space="preserve"> </w:t>
       </w:r>
       <w:r>
-        <w:rPr>
-          <w:spacing w:val="25"/>
-        </w:rPr>
         <w:t>{pekerjaan}</w:t>
       </w:r>
     </w:p>
@@ -1112,9 +1184,6 @@
         <w:t xml:space="preserve"> </w:t>
       </w:r>
       <w:r>
-        <w:rPr>
-          <w:spacing w:val="16"/>
-        </w:rPr>
         <w:t>{alamat}</w:t>
       </w:r>
     </w:p>
@@ -1177,9 +1246,11 @@
         </w:rPr>
         <w:t xml:space="preserve"> </w:t>
       </w:r>
+      <w:proofErr w:type="spellStart"/>
       <w:r>
         <w:t>Sukarama</w:t>
       </w:r>
+      <w:proofErr w:type="spellEnd"/>
       <w:r>
         <w:rPr>
           <w:spacing w:val="14"/>
@@ -1195,27 +1266,33 @@
         </w:rPr>
         <w:t xml:space="preserve"> </w:t>
       </w:r>
+      <w:proofErr w:type="spellStart"/>
       <w:r>
         <w:t>Bojongpicung</w:t>
       </w:r>
+      <w:proofErr w:type="spellEnd"/>
       <w:r>
         <w:rPr>
           <w:spacing w:val="14"/>
         </w:rPr>
         <w:t xml:space="preserve"> </w:t>
       </w:r>
+      <w:proofErr w:type="spellStart"/>
       <w:r>
         <w:t>Kabupaten</w:t>
       </w:r>
+      <w:proofErr w:type="spellEnd"/>
       <w:r>
         <w:rPr>
           <w:spacing w:val="15"/>
         </w:rPr>
         <w:t xml:space="preserve"> </w:t>
       </w:r>
+      <w:proofErr w:type="spellStart"/>
       <w:r>
         <w:t>Cianjur</w:t>
       </w:r>
+      <w:proofErr w:type="spellEnd"/>
       <w:r>
         <w:rPr>
           <w:spacing w:val="14"/>
@@ -1232,8 +1309,13 @@
         <w:t xml:space="preserve"> </w:t>
       </w:r>
       <w:r>
-        <w:t>bertempat tinggal/berdomisili</w:t>
-      </w:r>
+        <w:t>bertempat tinggal/</w:t>
+      </w:r>
+      <w:proofErr w:type="spellStart"/>
+      <w:r>
+        <w:t>berdomisili</w:t>
+      </w:r>
+      <w:proofErr w:type="spellEnd"/>
       <w:r>
         <w:rPr>
           <w:spacing w:val="-1"/>
@@ -1250,7 +1332,15 @@
         <w:t xml:space="preserve"> </w:t>
       </w:r>
       <w:r>
-        <w:t>alamat tersebut diatas.</w:t>
+        <w:t xml:space="preserve">alamat tersebut </w:t>
+      </w:r>
+      <w:proofErr w:type="spellStart"/>
+      <w:r>
+        <w:t>diatas</w:t>
+      </w:r>
+      <w:proofErr w:type="spellEnd"/>
+      <w:r>
+        <w:t>.</w:t>
       </w:r>
     </w:p>
     <w:p>
@@ -1268,7 +1358,15 @@
         <w:ind w:left="100"/>
       </w:pPr>
       <w:r>
-        <w:t>Surat Keterangan ini dibuat dalam rangka untuk keperluan:</w:t>
+        <w:t xml:space="preserve">Surat Keterangan ini </w:t>
+      </w:r>
+      <w:proofErr w:type="spellStart"/>
+      <w:r>
+        <w:t>dibuat</w:t>
+      </w:r>
+      <w:proofErr w:type="spellEnd"/>
+      <w:r>
+        <w:t xml:space="preserve"> dalam rangka untuk keperluan:</w:t>
       </w:r>
     </w:p>
     <w:p>
@@ -1278,14 +1376,34 @@
         <w:ind w:left="0"/>
         <w:jc w:val="center"/>
         <w:rPr>
+          <w:i/>
+          <w:iCs/>
           <w:u w:val="none"/>
         </w:rPr>
       </w:pPr>
       <w:r>
         <w:rPr>
+          <w:i/>
+          <w:iCs/>
           <w:u w:val="none"/>
         </w:rPr>
-        <w:t>{keperluan}</w:t>
+        <w:t>{</w:t>
+      </w:r>
+      <w:r>
+        <w:rPr>
+          <w:i/>
+          <w:iCs/>
+          <w:u w:val="none"/>
+        </w:rPr>
+        <w:t>KEPERLUAN</w:t>
+      </w:r>
+      <w:r>
+        <w:rPr>
+          <w:i/>
+          <w:iCs/>
+          <w:u w:val="none"/>
+        </w:rPr>
+        <w:t>}</w:t>
       </w:r>
     </w:p>
     <w:p>
@@ -1295,13 +1413,27 @@
         <w:ind w:left="100"/>
       </w:pPr>
       <w:r>
-        <w:t>Berlaku sampai dengan tanggal:</w:t>
-      </w:r>
-      <w:r>
-        <w:t xml:space="preserve"> </w:t>
-      </w:r>
-      <w:r>
-        <w:t>{tanggal_berlaku}</w:t>
+        <w:t>Berlaku sampai dengan tanggal</w:t>
+      </w:r>
+      <w:r>
+        <w:t xml:space="preserve"> </w:t>
+      </w:r>
+      <w:r>
+        <w:t>:</w:t>
+      </w:r>
+      <w:r>
+        <w:t xml:space="preserve"> </w:t>
+      </w:r>
+      <w:r>
+        <w:t>{</w:t>
+      </w:r>
+      <w:proofErr w:type="spellStart"/>
+      <w:r>
+        <w:t>tanggal_berlaku</w:t>
+      </w:r>
+      <w:proofErr w:type="spellEnd"/>
+      <w:r>
+        <w:t>}</w:t>
       </w:r>
     </w:p>
     <w:p>
@@ -1346,9 +1478,11 @@
         </w:rPr>
         <w:t xml:space="preserve"> </w:t>
       </w:r>
+      <w:proofErr w:type="spellStart"/>
       <w:r>
         <w:t>dibuat</w:t>
       </w:r>
+      <w:proofErr w:type="spellEnd"/>
       <w:r>
         <w:rPr>
           <w:spacing w:val="34"/>
@@ -1425,172 +1559,50 @@
     <w:p>
       <w:pPr>
         <w:pStyle w:val="BodyText"/>
-        <w:spacing w:before="24" w:line="261" w:lineRule="auto"/>
-        <w:ind w:left="100"/>
-      </w:pPr>
-    </w:p>
-    <w:p>
-      <w:pPr>
-        <w:pStyle w:val="BodyText"/>
-        <w:spacing w:before="24" w:line="261" w:lineRule="auto"/>
-        <w:ind w:left="100"/>
-      </w:pPr>
-    </w:p>
-    <w:p>
-      <w:pPr>
-        <w:pStyle w:val="BodyText"/>
-        <w:spacing w:before="24" w:line="261" w:lineRule="auto"/>
-        <w:ind w:left="1540"/>
-      </w:pPr>
-      <w:r>
-        <w:t xml:space="preserve"> </w:t>
-      </w:r>
-      <w:r>
-        <w:t>Yang</w:t>
-      </w:r>
-      <w:r>
-        <w:rPr>
-          <w:spacing w:val="-15"/>
-        </w:rPr>
-        <w:t xml:space="preserve"> </w:t>
-      </w:r>
-      <w:r>
-        <w:t>Bersangkutan</w:t>
-      </w:r>
-      <w:r>
-        <w:tab/>
-      </w:r>
-      <w:r>
-        <w:tab/>
-      </w:r>
-      <w:r>
-        <w:tab/>
-      </w:r>
-      <w:r>
-        <w:tab/>
-      </w:r>
-      <w:r>
-        <w:tab/>
-        <w:t xml:space="preserve">Sukarama, </w:t>
-      </w:r>
-      <w:r>
-        <w:t>{tanggal_surat}</w:t>
-      </w:r>
-    </w:p>
-    <w:p>
-      <w:pPr>
-        <w:pStyle w:val="BodyText"/>
-        <w:spacing w:before="24" w:line="261" w:lineRule="auto"/>
-        <w:ind w:left="1540"/>
-      </w:pPr>
-      <w:r>
-        <w:tab/>
-      </w:r>
-      <w:r>
-        <w:tab/>
-      </w:r>
-      <w:r>
-        <w:tab/>
-      </w:r>
-      <w:r>
-        <w:tab/>
-      </w:r>
-      <w:r>
-        <w:tab/>
-      </w:r>
-      <w:r>
-        <w:tab/>
-      </w:r>
-      <w:r>
-        <w:tab/>
-      </w:r>
-      <w:r>
-        <w:t>{jabatan_penandatangan}</w:t>
-      </w:r>
-    </w:p>
-    <w:p>
-      <w:pPr>
-        <w:pStyle w:val="BodyText"/>
-        <w:rPr>
-          <w:sz w:val="20"/>
-        </w:rPr>
-      </w:pPr>
-    </w:p>
-    <w:p>
-      <w:pPr>
-        <w:pStyle w:val="BodyText"/>
-        <w:rPr>
-          <w:sz w:val="20"/>
-        </w:rPr>
-      </w:pPr>
-    </w:p>
-    <w:p>
-      <w:pPr>
-        <w:pStyle w:val="BodyText"/>
-        <w:rPr>
-          <w:sz w:val="20"/>
-        </w:rPr>
-      </w:pPr>
-      <w:r>
-        <w:rPr>
-          <w:sz w:val="20"/>
-        </w:rPr>
-        <w:tab/>
-      </w:r>
-      <w:r>
-        <w:rPr>
-          <w:sz w:val="20"/>
-        </w:rPr>
-        <w:tab/>
-      </w:r>
-      <w:r>
-        <w:rPr>
-          <w:sz w:val="20"/>
-        </w:rPr>
-        <w:tab/>
-      </w:r>
-      <w:r>
-        <w:rPr>
-          <w:sz w:val="20"/>
-        </w:rPr>
-        <w:tab/>
-      </w:r>
-      <w:r>
-        <w:rPr>
-          <w:sz w:val="20"/>
-        </w:rPr>
-        <w:tab/>
-      </w:r>
-      <w:r>
-        <w:rPr>
-          <w:sz w:val="20"/>
-        </w:rPr>
-        <w:tab/>
-      </w:r>
-      <w:r>
-        <w:rPr>
-          <w:sz w:val="20"/>
-        </w:rPr>
-        <w:tab/>
-      </w:r>
-      <w:r>
-        <w:rPr>
-          <w:sz w:val="20"/>
-        </w:rPr>
-        <w:tab/>
-      </w:r>
-      <w:r>
-        <w:rPr>
-          <w:sz w:val="20"/>
-        </w:rPr>
-        <w:tab/>
-      </w:r>
-      <w:r>
-        <w:rPr>
-          <w:sz w:val="20"/>
-        </w:rPr>
-        <w:t>{%ttd}</w:t>
-      </w:r>
+        <w:rPr>
+          <w:sz w:val="20"/>
+        </w:rPr>
+      </w:pPr>
+    </w:p>
+    <w:p>
+      <w:pPr>
+        <w:pStyle w:val="BodyText"/>
+        <w:rPr>
+          <w:sz w:val="20"/>
+        </w:rPr>
+      </w:pPr>
+    </w:p>
+    <w:p>
+      <w:pPr>
+        <w:pStyle w:val="BodyText"/>
+        <w:rPr>
+          <w:sz w:val="20"/>
+        </w:rPr>
+      </w:pPr>
+    </w:p>
+    <w:p>
+      <w:pPr>
+        <w:pStyle w:val="BodyText"/>
+        <w:rPr>
+          <w:sz w:val="20"/>
+        </w:rPr>
+      </w:pPr>
+    </w:p>
+    <w:p>
+      <w:pPr>
+        <w:pStyle w:val="BodyText"/>
+        <w:rPr>
+          <w:sz w:val="20"/>
+        </w:rPr>
+      </w:pPr>
+    </w:p>
+    <w:p>
+      <w:pPr>
+        <w:pStyle w:val="BodyText"/>
+        <w:rPr>
+          <w:sz w:val="20"/>
+        </w:rPr>
+      </w:pPr>
     </w:p>
     <w:p>
       <w:pPr>
@@ -1603,73 +1615,6 @@
     </w:p>
     <w:p>
       <w:pPr>
-        <w:pStyle w:val="BodyText"/>
-        <w:spacing w:before="4"/>
-        <w:rPr>
-          <w:sz w:val="23"/>
-        </w:rPr>
-      </w:pPr>
-    </w:p>
-    <w:p>
-      <w:pPr>
-        <w:spacing w:line="261" w:lineRule="auto"/>
-        <w:ind w:left="720" w:right="288" w:firstLine="720"/>
-        <w:rPr>
-          <w:b/>
-          <w:sz w:val="24"/>
-        </w:rPr>
-      </w:pPr>
-      <w:r>
-        <w:rPr>
-          <w:b/>
-          <w:bCs/>
-          <w:sz w:val="24"/>
-          <w:szCs w:val="24"/>
-          <w:lang w:val="id-ID"/>
-        </w:rPr>
-        <w:t>{nama}</w:t>
-      </w:r>
-      <w:r>
-        <w:rPr>
-          <w:lang w:val="id-ID"/>
-        </w:rPr>
-        <w:tab/>
-      </w:r>
-      <w:r>
-        <w:rPr>
-          <w:lang w:val="id-ID"/>
-        </w:rPr>
-        <w:tab/>
-      </w:r>
-      <w:r>
-        <w:rPr>
-          <w:lang w:val="id-ID"/>
-        </w:rPr>
-        <w:tab/>
-      </w:r>
-      <w:r>
-        <w:rPr>
-          <w:lang w:val="id-ID"/>
-        </w:rPr>
-        <w:tab/>
-      </w:r>
-      <w:r>
-        <w:rPr>
-          <w:lang w:val="id-ID"/>
-        </w:rPr>
-        <w:tab/>
-      </w:r>
-      <w:r>
-        <w:rPr>
-          <w:b/>
-          <w:sz w:val="24"/>
-        </w:rPr>
-        <w:t>{nama_penandatangan}</w:t>
-      </w:r>
-    </w:p>
-    <w:p>
-      <w:pPr>
-        <w:ind w:left="720" w:firstLine="720"/>
         <w:rPr>
           <w:sz w:val="23"/>
         </w:rPr>
@@ -1685,7 +1630,374 @@
       <w:pPr>
         <w:pStyle w:val="BodyText"/>
         <w:rPr>
-          <w:sz w:val="26"/>
+          <w:sz w:val="34"/>
+        </w:rPr>
+      </w:pPr>
+    </w:p>
+    <w:p>
+      <w:pPr>
+        <w:pStyle w:val="BodyText"/>
+        <w:ind w:left="720" w:firstLine="720"/>
+      </w:pPr>
+      <w:r>
+        <w:t>Yang</w:t>
+      </w:r>
+      <w:r>
+        <w:rPr>
+          <w:spacing w:val="-15"/>
+        </w:rPr>
+        <w:t xml:space="preserve"> </w:t>
+      </w:r>
+      <w:r>
+        <w:t>Bersangkutan</w:t>
+      </w:r>
+    </w:p>
+    <w:p>
+      <w:pPr>
+        <w:pStyle w:val="BodyText"/>
+        <w:spacing w:before="90"/>
+        <w:ind w:left="1440" w:firstLine="720"/>
+      </w:pPr>
+    </w:p>
+    <w:p>
+      <w:pPr>
+        <w:pStyle w:val="BodyText"/>
+        <w:spacing w:before="90"/>
+        <w:ind w:left="1440" w:firstLine="720"/>
+      </w:pPr>
+      <w:r>
+        <w:br w:type="column"/>
+      </w:r>
+      <w:r>
+        <w:t xml:space="preserve"> </w:t>
+      </w:r>
+      <w:proofErr w:type="spellStart"/>
+      <w:r>
+        <w:t>Sukarama</w:t>
+      </w:r>
+      <w:proofErr w:type="spellEnd"/>
+      <w:r>
+        <w:t xml:space="preserve">, </w:t>
+      </w:r>
+      <w:r>
+        <w:t>{</w:t>
+      </w:r>
+      <w:proofErr w:type="spellStart"/>
+      <w:r>
+        <w:t>tanggal_surat</w:t>
+      </w:r>
+      <w:proofErr w:type="spellEnd"/>
+      <w:r>
+        <w:t>}</w:t>
+      </w:r>
+    </w:p>
+    <w:p>
+      <w:pPr>
+        <w:pStyle w:val="BodyText"/>
+        <w:spacing w:before="24" w:line="261" w:lineRule="auto"/>
+        <w:ind w:left="2160"/>
+      </w:pPr>
+      <w:r>
+        <w:t>{</w:t>
+      </w:r>
+      <w:proofErr w:type="spellStart"/>
+      <w:r>
+        <w:t>jabatan_penandatangan</w:t>
+      </w:r>
+      <w:proofErr w:type="spellEnd"/>
+      <w:r>
+        <w:t>}</w:t>
+      </w:r>
+    </w:p>
+    <w:p>
+      <w:pPr>
+        <w:spacing w:line="261" w:lineRule="auto"/>
+      </w:pPr>
+    </w:p>
+    <w:p>
+      <w:pPr>
+        <w:spacing w:line="261" w:lineRule="auto"/>
+        <w:sectPr>
+          <w:type w:val="continuous"/>
+          <w:pgSz w:w="12240" w:h="20160"/>
+          <w:pgMar w:top="780" w:right="740" w:bottom="280" w:left="740" w:header="720" w:footer="720" w:gutter="0"/>
+          <w:cols w:num="2" w:space="720" w:equalWidth="0">
+            <w:col w:w="3718" w:space="643"/>
+            <w:col w:w="6399"/>
+          </w:cols>
+        </w:sectPr>
+      </w:pPr>
+    </w:p>
+    <w:p>
+      <w:pPr>
+        <w:pStyle w:val="BodyText"/>
+        <w:rPr>
+          <w:sz w:val="20"/>
+        </w:rPr>
+      </w:pPr>
+    </w:p>
+    <w:p>
+      <w:pPr>
+        <w:pStyle w:val="BodyText"/>
+        <w:rPr>
+          <w:sz w:val="22"/>
+          <w:szCs w:val="22"/>
+        </w:rPr>
+      </w:pPr>
+      <w:r>
+        <w:rPr>
+          <w:sz w:val="20"/>
+        </w:rPr>
+        <w:tab/>
+      </w:r>
+      <w:r>
+        <w:rPr>
+          <w:sz w:val="20"/>
+        </w:rPr>
+        <w:tab/>
+      </w:r>
+      <w:r>
+        <w:rPr>
+          <w:sz w:val="20"/>
+        </w:rPr>
+        <w:tab/>
+      </w:r>
+      <w:r>
+        <w:rPr>
+          <w:sz w:val="20"/>
+        </w:rPr>
+        <w:tab/>
+      </w:r>
+      <w:r>
+        <w:rPr>
+          <w:sz w:val="20"/>
+        </w:rPr>
+        <w:tab/>
+      </w:r>
+      <w:r>
+        <w:rPr>
+          <w:sz w:val="20"/>
+        </w:rPr>
+        <w:tab/>
+      </w:r>
+      <w:r>
+        <w:rPr>
+          <w:sz w:val="20"/>
+        </w:rPr>
+        <w:tab/>
+      </w:r>
+      <w:r>
+        <w:rPr>
+          <w:sz w:val="20"/>
+        </w:rPr>
+        <w:tab/>
+      </w:r>
+      <w:r>
+        <w:rPr>
+          <w:sz w:val="20"/>
+        </w:rPr>
+        <w:tab/>
+      </w:r>
+      <w:r>
+        <w:rPr>
+          <w:sz w:val="20"/>
+        </w:rPr>
+        <w:tab/>
+      </w:r>
+      <w:r>
+        <w:rPr>
+          <w:sz w:val="22"/>
+          <w:szCs w:val="22"/>
+        </w:rPr>
+        <w:t>{%</w:t>
+      </w:r>
+      <w:proofErr w:type="spellStart"/>
+      <w:r>
+        <w:rPr>
+          <w:sz w:val="22"/>
+          <w:szCs w:val="22"/>
+        </w:rPr>
+        <w:t>ttd</w:t>
+      </w:r>
+      <w:proofErr w:type="spellEnd"/>
+      <w:r>
+        <w:rPr>
+          <w:sz w:val="22"/>
+          <w:szCs w:val="22"/>
+        </w:rPr>
+        <w:t>}</w:t>
+      </w:r>
+    </w:p>
+    <w:p>
+      <w:pPr>
+        <w:pStyle w:val="BodyText"/>
+        <w:rPr>
+          <w:sz w:val="22"/>
+          <w:szCs w:val="22"/>
+        </w:rPr>
+      </w:pPr>
+    </w:p>
+    <w:p>
+      <w:pPr>
+        <w:pStyle w:val="BodyText"/>
+        <w:rPr>
+          <w:sz w:val="20"/>
+        </w:rPr>
+      </w:pPr>
+    </w:p>
+    <w:p>
+      <w:pPr>
+        <w:pStyle w:val="BodyText"/>
+        <w:rPr>
+          <w:sz w:val="20"/>
+        </w:rPr>
+      </w:pPr>
+    </w:p>
+    <w:p>
+      <w:pPr>
+        <w:spacing w:line="261" w:lineRule="auto"/>
+        <w:ind w:left="720" w:right="288" w:firstLine="720"/>
+        <w:rPr>
+          <w:b/>
+          <w:sz w:val="24"/>
+          <w:u w:val="single"/>
+        </w:rPr>
+      </w:pPr>
+      <w:r>
+        <w:rPr>
+          <w:b/>
+          <w:bCs/>
+          <w:sz w:val="24"/>
+          <w:szCs w:val="24"/>
+          <w:lang w:val="id-ID"/>
+        </w:rPr>
+        <w:t>{nama}</w:t>
+      </w:r>
+      <w:r>
+        <w:rPr>
+          <w:b/>
+          <w:bCs/>
+          <w:sz w:val="24"/>
+          <w:szCs w:val="24"/>
+          <w:lang w:val="id-ID"/>
+        </w:rPr>
+        <w:tab/>
+      </w:r>
+      <w:r>
+        <w:rPr>
+          <w:b/>
+          <w:bCs/>
+          <w:sz w:val="24"/>
+          <w:szCs w:val="24"/>
+          <w:lang w:val="id-ID"/>
+        </w:rPr>
+        <w:tab/>
+      </w:r>
+      <w:r>
+        <w:rPr>
+          <w:b/>
+          <w:bCs/>
+          <w:sz w:val="24"/>
+          <w:szCs w:val="24"/>
+          <w:lang w:val="id-ID"/>
+        </w:rPr>
+        <w:tab/>
+      </w:r>
+      <w:r>
+        <w:rPr>
+          <w:b/>
+          <w:bCs/>
+          <w:sz w:val="24"/>
+          <w:szCs w:val="24"/>
+          <w:lang w:val="id-ID"/>
+        </w:rPr>
+        <w:tab/>
+      </w:r>
+      <w:r>
+        <w:rPr>
+          <w:b/>
+          <w:bCs/>
+          <w:sz w:val="24"/>
+          <w:szCs w:val="24"/>
+          <w:lang w:val="id-ID"/>
+        </w:rPr>
+        <w:tab/>
+      </w:r>
+      <w:r>
+        <w:rPr>
+          <w:b/>
+          <w:bCs/>
+          <w:sz w:val="24"/>
+          <w:szCs w:val="24"/>
+          <w:lang w:val="id-ID"/>
+        </w:rPr>
+        <w:tab/>
+      </w:r>
+      <w:r>
+        <w:rPr>
+          <w:b/>
+          <w:sz w:val="24"/>
+          <w:u w:val="single"/>
+        </w:rPr>
+        <w:t>{</w:t>
+      </w:r>
+      <w:proofErr w:type="spellStart"/>
+      <w:r>
+        <w:rPr>
+          <w:b/>
+          <w:sz w:val="24"/>
+          <w:u w:val="single"/>
+        </w:rPr>
+        <w:t>nama_penandatangan</w:t>
+      </w:r>
+      <w:proofErr w:type="spellEnd"/>
+      <w:r>
+        <w:rPr>
+          <w:b/>
+          <w:sz w:val="24"/>
+          <w:u w:val="single"/>
+        </w:rPr>
+        <w:t>}</w:t>
+      </w:r>
+    </w:p>
+    <w:p>
+      <w:pPr>
+        <w:rPr>
+          <w:sz w:val="20"/>
+        </w:rPr>
+        <w:sectPr>
+          <w:type w:val="continuous"/>
+          <w:pgSz w:w="12240" w:h="20160"/>
+          <w:pgMar w:top="780" w:right="740" w:bottom="280" w:left="740" w:header="720" w:footer="720" w:gutter="0"/>
+          <w:cols w:space="720"/>
+        </w:sectPr>
+      </w:pPr>
+    </w:p>
+    <w:p>
+      <w:pPr>
+        <w:pStyle w:val="BodyText"/>
+        <w:spacing w:before="4"/>
+        <w:rPr>
+          <w:b/>
+          <w:sz w:val="23"/>
+        </w:rPr>
+      </w:pPr>
+    </w:p>
+    <w:p>
+      <w:pPr>
+        <w:spacing w:line="261" w:lineRule="auto"/>
+        <w:rPr>
+          <w:b/>
+          <w:sz w:val="24"/>
+        </w:rPr>
+      </w:pPr>
+    </w:p>
+    <w:p>
+      <w:pPr>
+        <w:spacing w:line="261" w:lineRule="auto"/>
+        <w:rPr>
+          <w:b/>
+          <w:sz w:val="24"/>
         </w:rPr>
       </w:pPr>
     </w:p>
@@ -1705,6 +2017,24 @@
           </w:cols>
         </w:sectPr>
       </w:pPr>
+      <w:r>
+        <w:rPr>
+          <w:sz w:val="24"/>
+        </w:rPr>
+        <w:tab/>
+      </w:r>
+      <w:r>
+        <w:rPr>
+          <w:sz w:val="24"/>
+        </w:rPr>
+        <w:tab/>
+      </w:r>
+      <w:r>
+        <w:rPr>
+          <w:sz w:val="24"/>
+        </w:rPr>
+        <w:tab/>
+      </w:r>
     </w:p>
     <w:p>
       <w:pPr>
@@ -1730,7 +2060,7 @@
           <w:sz w:val="20"/>
         </w:rPr>
         <w:drawing>
-          <wp:inline distT="0" distB="0" distL="0" distR="0" wp14:anchorId="38FD5ADA" wp14:editId="6A9327E6">
+          <wp:inline distT="0" distB="0" distL="0" distR="0" wp14:anchorId="66B326DB" wp14:editId="01E697D3">
             <wp:extent cx="700710" cy="700087"/>
             <wp:effectExtent l="0" t="0" r="0" b="0"/>
             <wp:docPr id="3" name="image2.png"/>
@@ -1939,7 +2269,7 @@
 </file>
 
 <file path=word/styles.xml><?xml version="1.0" encoding="utf-8"?>
-<w:styles xmlns:mc="http://schemas.openxmlformats.org/markup-compatibility/2006" xmlns:r="http://schemas.openxmlformats.org/officeDocument/2006/relationships" xmlns:w="http://schemas.openxmlformats.org/wordprocessingml/2006/main" xmlns:w14="http://schemas.microsoft.com/office/word/2010/wordml" xmlns:w15="http://schemas.microsoft.com/office/word/2012/wordml" xmlns:w16cex="http://schemas.microsoft.com/office/word/2018/wordml/cex" xmlns:w16cid="http://schemas.microsoft.com/office/word/2016/wordml/cid" xmlns:w16="http://schemas.microsoft.com/office/word/2018/wordml" xmlns:w16du="http://schemas.microsoft.com/office/word/2023/wordml/word16du" xmlns:w16sdtdh="http://schemas.microsoft.com/office/word/2020/wordml/sdtdatahash" xmlns:w16sdtfl="http://schemas.microsoft.com/office/word/2024/wordml/sdtformatlock" xmlns:w16se="http://schemas.microsoft.com/office/word/2015/wordml/symex" mc:Ignorable="w14 w15 w16se w16cid w16 w16cex w16sdtdh w16sdtfl w16du">
+<w:styles xmlns:mc="http://schemas.openxmlformats.org/markup-compatibility/2006" xmlns:r="http://schemas.openxmlformats.org/officeDocument/2006/relationships" xmlns:w="http://schemas.openxmlformats.org/wordprocessingml/2006/main" xmlns:w14="http://schemas.microsoft.com/office/word/2010/wordml" xmlns:w15="http://schemas.microsoft.com/office/word/2012/wordml" xmlns:w16cex="http://schemas.microsoft.com/office/word/2018/wordml/cex" xmlns:w16cid="http://schemas.microsoft.com/office/word/2016/wordml/cid" xmlns:w16="http://schemas.microsoft.com/office/word/2018/wordml" xmlns:w16sdtdh="http://schemas.microsoft.com/office/word/2020/wordml/sdtdatahash" xmlns:w16sdtfl="http://schemas.microsoft.com/office/word/2024/wordml/sdtformatlock" xmlns:w16se="http://schemas.microsoft.com/office/word/2015/wordml/symex" xmlns:w16du="http://schemas.microsoft.com/office/word/2023/wordml/word16du" mc:Ignorable="w14 w15 w16se w16cid w16 w16cex w16sdtdh w16sdtfl w16du">
   <w:docDefaults>
     <w:rPrDefault>
       <w:rPr>

</xml_diff>

<commit_message>
Update UI animations, layout adjustments, and new photo assets
</commit_message>
<xml_diff>
--- a/apps/web/public/templates/Surat_Domisili.docx
+++ b/apps/web/public/templates/Surat_Domisili.docx
@@ -1551,7 +1551,7 @@
         </w:sectPr>
       </w:pPr>
       <w:r>
-        <w:t xml:space="preserve">      </w:t>
+        <w:t xml:space="preserve">    </w:t>
       </w:r>
       <w:r>
         <w:t>{jabatan_penandatangan}</w:t>
@@ -1623,7 +1623,7 @@
         <w:rPr>
           <w:sz w:val="20"/>
         </w:rPr>
-        <w:tab/>
+        <w:t xml:space="preserve">     </w:t>
       </w:r>
       <w:r>
         <w:rPr>
@@ -1669,7 +1669,7 @@
           <w:szCs w:val="24"/>
           <w:lang w:val="id-ID"/>
         </w:rPr>
-        <w:t>{nama}</w:t>
+        <w:t xml:space="preserve">             </w:t>
       </w:r>
       <w:r>
         <w:rPr>
@@ -1679,7 +1679,7 @@
           <w:szCs w:val="24"/>
           <w:lang w:val="id-ID"/>
         </w:rPr>
-        <w:tab/>
+        <w:t>{nama}</w:t>
       </w:r>
       <w:r>
         <w:rPr>
@@ -1710,6 +1710,36 @@
           <w:lang w:val="id-ID"/>
         </w:rPr>
         <w:tab/>
+      </w:r>
+      <w:r>
+        <w:rPr>
+          <w:b/>
+          <w:bCs/>
+          <w:sz w:val="24"/>
+          <w:szCs w:val="24"/>
+          <w:lang w:val="id-ID"/>
+        </w:rPr>
+        <w:tab/>
+      </w:r>
+      <w:r>
+        <w:rPr>
+          <w:b/>
+          <w:bCs/>
+          <w:sz w:val="24"/>
+          <w:szCs w:val="24"/>
+          <w:lang w:val="id-ID"/>
+        </w:rPr>
+        <w:tab/>
+      </w:r>
+      <w:r>
+        <w:rPr>
+          <w:b/>
+          <w:bCs/>
+          <w:sz w:val="24"/>
+          <w:szCs w:val="24"/>
+          <w:lang w:val="id-ID"/>
+        </w:rPr>
+        <w:t xml:space="preserve">    </w:t>
       </w:r>
       <w:r>
         <w:rPr>

</xml_diff>